<commit_message>
description courte de ce que tu as changé
</commit_message>
<xml_diff>
--- a/DA V3.docx
+++ b/DA V3.docx
@@ -14,11 +14,582 @@
           <w:b/>
           <w:bCs/>
         </w:rPr>
+        <w:t>ONLY INSIDE — VERSION FINALE + INSTRUCTIONS DA</w:t>
+      </w:r>
+    </w:p>
+    <w:p>
+      <w:proofErr w:type="gramStart"/>
+      <w:r>
+        <w:t>pour</w:t>
+      </w:r>
+      <w:proofErr w:type="gramEnd"/>
+      <w:r>
+        <w:t xml:space="preserve"> </w:t>
+      </w:r>
+      <w:proofErr w:type="spellStart"/>
+      <w:r>
+        <w:t>claude</w:t>
+      </w:r>
+      <w:proofErr w:type="spellEnd"/>
+      <w:r>
+        <w:t> : Image portrait : prévoir un cadrage “</w:t>
+      </w:r>
+      <w:proofErr w:type="spellStart"/>
+      <w:r>
+        <w:t>safe</w:t>
+      </w:r>
+      <w:proofErr w:type="spellEnd"/>
+      <w:r>
+        <w:t xml:space="preserve"> mobile”.</w:t>
+      </w:r>
+      <w:r>
+        <w:br/>
+        <w:t>Le visage doit toujours être centré verticalement et légèrement au-dessus du centre (zone des yeux à ~40% de la hauteur).</w:t>
+      </w:r>
+      <w:r>
+        <w:br/>
+        <w:t>Éviter tout recadrage automatique qui coupe le haut de la tête ou le menton.</w:t>
+      </w:r>
+      <w:r>
+        <w:br/>
+        <w:t>Possibilité : utiliser une version spécifique mobile (</w:t>
+      </w:r>
+      <w:proofErr w:type="spellStart"/>
+      <w:r>
+        <w:t>crop</w:t>
+      </w:r>
+      <w:proofErr w:type="spellEnd"/>
+      <w:r>
+        <w:t xml:space="preserve"> différent) ou forcer un “</w:t>
+      </w:r>
+      <w:proofErr w:type="spellStart"/>
+      <w:r>
+        <w:t>object</w:t>
+      </w:r>
+      <w:proofErr w:type="spellEnd"/>
+      <w:r>
+        <w:t>-</w:t>
+      </w:r>
+      <w:proofErr w:type="gramStart"/>
+      <w:r>
+        <w:t>position:</w:t>
+      </w:r>
+      <w:proofErr w:type="gramEnd"/>
+      <w:r>
+        <w:t xml:space="preserve"> center 30%”.</w:t>
+      </w:r>
+      <w:r>
+        <w:br/>
+        <w:t>Privilégier un ratio légèrement vertical (</w:t>
+      </w:r>
+      <w:proofErr w:type="gramStart"/>
+      <w:r>
+        <w:t>4:</w:t>
+      </w:r>
+      <w:proofErr w:type="gramEnd"/>
+      <w:r>
+        <w:t>5) plutôt que trop allongé.</w:t>
+      </w:r>
+    </w:p>
+    <w:p>
+      <w:r>
+        <w:br/>
+      </w:r>
+    </w:p>
+    <w:p>
+      <w:r>
+        <w:t>Ensuite j’ai changé les textes de toutes les sections, tu peux tout ajuster. </w:t>
+      </w:r>
+      <w:proofErr w:type="gramStart"/>
+      <w:r>
+        <w:t>parfois</w:t>
+      </w:r>
+      <w:proofErr w:type="gramEnd"/>
+      <w:r>
+        <w:t xml:space="preserve"> la police est différente mais </w:t>
+      </w:r>
+      <w:proofErr w:type="spellStart"/>
+      <w:proofErr w:type="gramStart"/>
+      <w:r>
+        <w:t>ca</w:t>
+      </w:r>
+      <w:proofErr w:type="spellEnd"/>
+      <w:proofErr w:type="gramEnd"/>
+      <w:r>
+        <w:t xml:space="preserve"> tu ajustes évidemment, tu gardes la police que tu as déjà. Merci.</w:t>
+      </w:r>
+    </w:p>
+    <w:p>
+      <w:r>
+        <w:pict w14:anchorId="07321FB3">
+          <v:rect id="_x0000_i1116" style="width:0;height:1.5pt" o:hralign="center" o:hrstd="t" o:hr="t" fillcolor="#a0a0a0" stroked="f"/>
+        </w:pict>
+      </w:r>
+    </w:p>
+    <w:p>
+      <w:pPr>
+        <w:rPr>
+          <w:b/>
+          <w:bCs/>
+        </w:rPr>
+      </w:pPr>
+      <w:r>
+        <w:rPr>
+          <w:b/>
+          <w:bCs/>
+        </w:rPr>
+        <w:t>HERO</w:t>
+      </w:r>
+    </w:p>
+    <w:p>
+      <w:r>
+        <w:rPr>
+          <w:b/>
+          <w:bCs/>
+        </w:rPr>
+        <w:t>Only Inside</w:t>
+      </w:r>
+      <w:r>
+        <w:rPr>
+          <w:b/>
+          <w:bCs/>
+        </w:rPr>
+        <w:br/>
+      </w:r>
+      <w:r>
+        <w:t>Ici, le corps est écouté.</w:t>
+      </w:r>
+    </w:p>
+    <w:p>
+      <w:r>
+        <w:t>Un espace pour ralentir, relâcher, et revenir à soi à travers le corps.</w:t>
+      </w:r>
+    </w:p>
+    <w:p>
+      <w:r>
+        <w:pict w14:anchorId="28F6CFCC">
+          <v:rect id="_x0000_i1117" style="width:0;height:1.5pt" o:hralign="center" o:hrstd="t" o:hr="t" fillcolor="#a0a0a0" stroked="f"/>
+        </w:pict>
+      </w:r>
+    </w:p>
+    <w:p>
+      <w:pPr>
+        <w:rPr>
+          <w:b/>
+          <w:bCs/>
+        </w:rPr>
+      </w:pPr>
+      <w:r>
+        <w:rPr>
+          <w:b/>
+          <w:bCs/>
+        </w:rPr>
+        <w:t>SECTION 1 — L’ESPACE</w:t>
+      </w:r>
+    </w:p>
+    <w:p>
+      <w:r>
+        <w:t>Un espace pour déposer ce qui est là.</w:t>
+      </w:r>
+      <w:r>
+        <w:br/>
+        <w:t>Pour laisser le corps se détendre, sans attente.</w:t>
+      </w:r>
+    </w:p>
+    <w:p>
+      <w:r>
+        <w:t>Ici, on ralentit.</w:t>
+      </w:r>
+      <w:r>
+        <w:br/>
+        <w:t>On revient aux sensations simples.</w:t>
+      </w:r>
+    </w:p>
+    <w:p>
+      <w:r>
+        <w:pict w14:anchorId="1F8EA0AD">
+          <v:rect id="_x0000_i1118" style="width:0;height:1.5pt" o:hralign="center" o:hrstd="t" o:hr="t" fillcolor="#a0a0a0" stroked="f"/>
+        </w:pict>
+      </w:r>
+    </w:p>
+    <w:p>
+      <w:pPr>
+        <w:rPr>
+          <w:b/>
+          <w:bCs/>
+        </w:rPr>
+      </w:pPr>
+      <w:r>
+        <w:rPr>
+          <w:b/>
+          <w:bCs/>
+        </w:rPr>
+        <w:t>SECTION 2 — LE SOIN</w:t>
+      </w:r>
+    </w:p>
+    <w:p>
+      <w:r>
+        <w:t>Un massage unique.</w:t>
+      </w:r>
+      <w:r>
+        <w:br/>
+        <w:t>Un soin qui se construit dans l’instant,</w:t>
+      </w:r>
+      <w:r>
+        <w:br/>
+        <w:t>à partir de ce que le corps exprime.</w:t>
+      </w:r>
+    </w:p>
+    <w:p>
+      <w:r>
+        <w:t>Plus qu’un enchaînement de gestes, le soin se vit comme une expérience, progressive et évolutive,</w:t>
+      </w:r>
+      <w:r>
+        <w:br/>
+        <w:t>où le corps peut relâcher à son rythme.</w:t>
+      </w:r>
+    </w:p>
+    <w:p>
+      <w:r>
+        <w:t>Le toucher est lent, enveloppant, parfois plus appuyé.</w:t>
+      </w:r>
+      <w:r>
+        <w:br/>
+        <w:t>Il suit le corps plutôt qu’il ne le dirige.</w:t>
+      </w:r>
+    </w:p>
+    <w:p>
+      <w:r>
+        <w:t>Un espace pour relâcher,</w:t>
+      </w:r>
+      <w:r>
+        <w:br/>
+        <w:t>et retrouver un état de présence plus simple.</w:t>
+      </w:r>
+    </w:p>
+    <w:p>
+      <w:r>
+        <w:t>Chaque séance est différente. Elle peut être profonde, douce, ou simplement être un moment de repos.</w:t>
+      </w:r>
+    </w:p>
+    <w:p>
+      <w:r>
+        <w:lastRenderedPageBreak/>
+        <w:t>Peu à peu, le corps peut :</w:t>
+      </w:r>
+      <w:r>
+        <w:br/>
+        <w:t>– relâcher les tensions physiques</w:t>
+      </w:r>
+      <w:r>
+        <w:br/>
+        <w:t>– se détendre en profondeur</w:t>
+      </w:r>
+      <w:r>
+        <w:br/>
+        <w:t>– apaiser le mental</w:t>
+      </w:r>
+      <w:r>
+        <w:br/>
+        <w:t>– retrouver une sensation de sécurité intérieure</w:t>
+      </w:r>
+      <w:r>
+        <w:br/>
+        <w:t>– revenir à des sensations plus simples</w:t>
+      </w:r>
+    </w:p>
+    <w:p>
+      <w:r>
+        <w:t>Le soin se reçoit à l’huile chaude, jusqu’au cuir chevelu.</w:t>
+      </w:r>
+      <w:r>
+        <w:br/>
+        <w:t>Un temps est laissé à la fin pour revenir tranquillement.</w:t>
+      </w:r>
+    </w:p>
+    <w:p>
+      <w:r>
+        <w:t>Des dimensions sonores et olfactives peuvent accompagner le soin,</w:t>
+      </w:r>
+      <w:r>
+        <w:br/>
+        <w:t>selon ce qui est juste dans l’instant.</w:t>
+      </w:r>
+    </w:p>
+    <w:p>
+      <w:r>
+        <w:pict w14:anchorId="3DB6BEFA">
+          <v:rect id="_x0000_i1119" style="width:0;height:1.5pt" o:hralign="center" o:hrstd="t" o:hr="t" fillcolor="#a0a0a0" stroked="f"/>
+        </w:pict>
+      </w:r>
+    </w:p>
+    <w:p>
+      <w:pPr>
+        <w:rPr>
+          <w:b/>
+          <w:bCs/>
+        </w:rPr>
+      </w:pPr>
+      <w:r>
+        <w:rPr>
+          <w:b/>
+          <w:bCs/>
+        </w:rPr>
+        <w:t>SECTION 3 — POUR QUI</w:t>
+      </w:r>
+    </w:p>
+    <w:p>
+      <w:r>
+        <w:t>Pour celles et ceux qui ressentent le besoin de ralentir,</w:t>
+      </w:r>
+      <w:r>
+        <w:br/>
+        <w:t>de sortir du mental</w:t>
+      </w:r>
+      <w:r>
+        <w:br/>
+        <w:t>et de revenir à quelque chose de plus simple, plus vivant.</w:t>
+      </w:r>
+    </w:p>
+    <w:p>
+      <w:r>
+        <w:br/>
+      </w:r>
+    </w:p>
+    <w:p>
+      <w:r>
+        <w:pict w14:anchorId="26C94427">
+          <v:rect id="_x0000_i1120" style="width:0;height:1.5pt" o:hralign="center" o:hrstd="t" o:hr="t" fillcolor="#a0a0a0" stroked="f"/>
+        </w:pict>
+      </w:r>
+    </w:p>
+    <w:p>
+      <w:pPr>
+        <w:rPr>
+          <w:b/>
+          <w:bCs/>
+        </w:rPr>
+      </w:pPr>
+      <w:r>
+        <w:rPr>
+          <w:b/>
+          <w:bCs/>
+        </w:rPr>
+        <w:t>SECTION 4 — PRÉSENTATION</w:t>
+      </w:r>
+    </w:p>
+    <w:p>
+      <w:r>
+        <w:t>Je m’appelle Eugénie.</w:t>
+      </w:r>
+      <w:r>
+        <w:br/>
+        <w:t>Je suis gersoise d’origine.</w:t>
+      </w:r>
+    </w:p>
+    <w:p>
+      <w:r>
+        <w:t>Mon chemin m’a menée du monde du luxe, sur la côte d’Azur, aux ashrams en Inde, où j’ai vécu plus d’un an, avant de revenir à quelque chose de plus simple.</w:t>
+      </w:r>
+    </w:p>
+    <w:p>
+      <w:r>
+        <w:t>Je continue depuis de me rendre régulièrement en Inde, un pays qui nourrit profondément mon rapport au corps, à la présence et au soin.</w:t>
+      </w:r>
+    </w:p>
+    <w:p>
+      <w:r>
+        <w:t>J’ai évolué dans des lieux d’exception, entre spas et hôtellerie haut de gamme, en tant que praticienne, professeure de yoga et au contact direct des personnes, dans des espaces où l’attention, la qualité de présence et le sens du détail sont essentiels.</w:t>
+      </w:r>
+    </w:p>
+    <w:p>
+      <w:r>
+        <w:t>Ces expériences, ainsi que mes voyages, ont nourri ma sensibilité, notamment à travers l’ayurvéda.</w:t>
+      </w:r>
+    </w:p>
+    <w:p>
+      <w:r>
+        <w:t>Aujourd’hui, j’accompagne par le corps à travers le massage, le yoga et la méditation, dans une approche à la fois sensible et ancrée, nourrie par ce parcours et par une formation continue en approches humanistes du corps et de la présence.</w:t>
+      </w:r>
+    </w:p>
+    <w:p>
+      <w:r>
+        <w:t>Chaque séance est un espace de présence, adapté à ce qui est là dans l’instant.</w:t>
+      </w:r>
+    </w:p>
+    <w:p>
+      <w:r>
+        <w:pict w14:anchorId="12486303">
+          <v:rect id="_x0000_i1121" style="width:0;height:1.5pt" o:hralign="center" o:hrstd="t" o:hr="t" fillcolor="#a0a0a0" stroked="f"/>
+        </w:pict>
+      </w:r>
+    </w:p>
+    <w:p>
+      <w:r>
+        <w:br/>
+      </w:r>
+    </w:p>
+    <w:p>
+      <w:pPr>
+        <w:rPr>
+          <w:b/>
+          <w:bCs/>
+        </w:rPr>
+      </w:pPr>
+      <w:r>
+        <w:rPr>
+          <w:b/>
+          <w:bCs/>
+        </w:rPr>
+        <w:t>SECTION 5 — LE SOIN</w:t>
+      </w:r>
+    </w:p>
+    <w:p>
+      <w:r>
+        <w:rPr>
+          <w:b/>
+          <w:bCs/>
+        </w:rPr>
+        <w:lastRenderedPageBreak/>
+        <w:t>Le soin signature Only Inside — Immersion</w:t>
+      </w:r>
+      <w:r>
+        <w:rPr>
+          <w:b/>
+          <w:bCs/>
+        </w:rPr>
+        <w:br/>
+        <w:t>1h30 — 95€</w:t>
+      </w:r>
+    </w:p>
+    <w:p>
+      <w:r>
+        <w:t>Un temps complet pour laisser le corps s’ouvrir progressivement, relâcher en profondeur et entrer pleinement dans l’expérience du soin.</w:t>
+      </w:r>
+      <w:r>
+        <w:br/>
+        <w:t>Le toucher se déploie de manière globale et progressive, permettant un relâchement plus profond.</w:t>
+      </w:r>
+    </w:p>
+    <w:p>
+      <w:r>
+        <w:t>Un temps d’accueil et de retour au calme est inclus.</w:t>
+      </w:r>
+      <w:r>
+        <w:br/>
+        <w:t>Pour une première séance, un temps d’échange permet d’ajuster le soin au plus juste.</w:t>
+      </w:r>
+      <w:r>
+        <w:br/>
+        <w:t>Il est recommandé d’arriver quelques minutes en avance afin de commencer la séance en douceur.</w:t>
+      </w:r>
+    </w:p>
+    <w:p>
+      <w:r>
+        <w:br/>
+      </w:r>
+    </w:p>
+    <w:p>
+      <w:pPr>
+        <w:rPr>
+          <w:b/>
+          <w:bCs/>
+        </w:rPr>
+      </w:pPr>
+      <w:r>
+        <w:rPr>
+          <w:b/>
+          <w:bCs/>
+        </w:rPr>
+        <w:t>SECTION 6 — AUTRES ACCOMPAGNEMENTS</w:t>
+      </w:r>
+    </w:p>
+    <w:p>
+      <w:r>
+        <w:t xml:space="preserve">En parallèle des soins, je propose également des temps autour du corps et de la présence, à travers le </w:t>
+      </w:r>
+      <w:proofErr w:type="spellStart"/>
+      <w:r>
+        <w:t>Hatha</w:t>
+      </w:r>
+      <w:proofErr w:type="spellEnd"/>
+      <w:r>
+        <w:t xml:space="preserve"> Yoga, le Yoga Nidra (relaxation profonde) et la méditation.</w:t>
+      </w:r>
+    </w:p>
+    <w:p>
+      <w:r>
+        <w:t>Ces séances peuvent se vivre ponctuellement, en individuel ou en petit groupe, dans des formats simples et adaptés au contexte.</w:t>
+      </w:r>
+    </w:p>
+    <w:p>
+      <w:r>
+        <w:t>Elles peuvent également être proposées pour des événements ou des temps collectifs.</w:t>
+      </w:r>
+    </w:p>
+    <w:p>
+      <w:r>
+        <w:t>Je me déplace.</w:t>
+      </w:r>
+    </w:p>
+    <w:p>
+      <w:r>
+        <w:t>Je vous invite à me contacter directement pour en échanger.</w:t>
+      </w:r>
+    </w:p>
+    <w:p>
+      <w:r>
+        <w:pict w14:anchorId="7E0B3191">
+          <v:rect id="_x0000_i1122" style="width:0;height:1.5pt" o:hralign="center" o:hrstd="t" o:hr="t" fillcolor="#a0a0a0" stroked="f"/>
+        </w:pict>
+      </w:r>
+    </w:p>
+    <w:p>
+      <w:pPr>
+        <w:rPr>
+          <w:b/>
+          <w:bCs/>
+        </w:rPr>
+      </w:pPr>
+      <w:r>
+        <w:rPr>
+          <w:b/>
+          <w:bCs/>
+        </w:rPr>
+        <w:t>SECTION 7 — RÉSERVATION</w:t>
+      </w:r>
+    </w:p>
+    <w:p>
+      <w:r>
+        <w:rPr>
+          <w:b/>
+          <w:bCs/>
+        </w:rPr>
+        <w:t>Si vous ressentez que c’est le bon moment, vous pouvez simplement me contacter.</w:t>
+      </w:r>
+    </w:p>
+    <w:p>
+      <w:r>
+        <w:t>Par message, WhatsApp ou email.</w:t>
+      </w:r>
+    </w:p>
+    <w:p>
+      <w:r>
+        <w:t>Les créneaux sont volontairement limités afin de préserver la qualité de présence de chaque séance.</w:t>
+      </w:r>
+    </w:p>
+    <w:p>
+      <w:r>
+        <w:t>Je vous répondrai personnellement, avec attention.</w:t>
+      </w:r>
+    </w:p>
+    <w:p>
+      <w:r>
         <w:drawing>
-          <wp:inline distT="0" distB="0" distL="0" distR="0" wp14:anchorId="0773B2BA" wp14:editId="7F949085">
+          <wp:inline distT="0" distB="0" distL="0" distR="0" wp14:anchorId="0E7992D2" wp14:editId="19AA42DB">
             <wp:extent cx="304800" cy="304800"/>
             <wp:effectExtent l="0" t="0" r="0" b="0"/>
-            <wp:docPr id="542193831" name="Image 8" descr="🌿"/>
+            <wp:docPr id="1427350776" name="Image 10" descr="👉"/>
             <wp:cNvGraphicFramePr>
               <a:graphicFrameLocks xmlns:a="http://schemas.openxmlformats.org/drawingml/2006/main" noChangeAspect="1"/>
             </wp:cNvGraphicFramePr>
@@ -26,7 +597,7 @@
               <a:graphicData uri="http://schemas.openxmlformats.org/drawingml/2006/picture">
                 <pic:pic xmlns:pic="http://schemas.openxmlformats.org/drawingml/2006/picture">
                   <pic:nvPicPr>
-                    <pic:cNvPr id="0" name="Picture 122" descr="🌿"/>
+                    <pic:cNvPr id="0" name="Picture 99" descr="👉"/>
                     <pic:cNvPicPr>
                       <a:picLocks noChangeAspect="1" noChangeArrowheads="1"/>
                     </pic:cNvPicPr>
@@ -64,179 +635,17 @@
         </w:drawing>
       </w:r>
       <w:r>
-        <w:rPr>
-          <w:b/>
-          <w:bCs/>
-        </w:rPr>
-        <w:t> VERSION PROPRE À ENVOYER À TA DA</w:t>
-      </w:r>
-    </w:p>
-    <w:p>
-      <w:pPr>
-        <w:numPr>
-          <w:ilvl w:val="0"/>
-          <w:numId w:val="1"/>
-        </w:numPr>
-        <w:rPr>
-          <w:b/>
-          <w:bCs/>
-        </w:rPr>
-      </w:pPr>
-      <w:r>
-        <w:rPr>
-          <w:b/>
-          <w:bCs/>
-        </w:rPr>
-        <w:t>Pas de prix affiché pour le yoga → </w:t>
-      </w:r>
-    </w:p>
-    <w:p>
-      <w:pPr>
-        <w:rPr>
-          <w:b/>
-          <w:bCs/>
-        </w:rPr>
-      </w:pPr>
-      <w:r>
-        <w:rPr>
-          <w:b/>
-          <w:bCs/>
-        </w:rPr>
-        <w:t>Je propose également des séances de yoga et de méditation,</w:t>
-      </w:r>
-      <w:r>
-        <w:rPr>
-          <w:b/>
-          <w:bCs/>
-        </w:rPr>
-        <w:br/>
-        <w:t>notamment dans le cadre d’événements ou de petits groupes.</w:t>
-      </w:r>
-    </w:p>
-    <w:p>
-      <w:pPr>
-        <w:rPr>
-          <w:b/>
-          <w:bCs/>
-        </w:rPr>
-      </w:pPr>
-      <w:r>
-        <w:rPr>
-          <w:b/>
-          <w:bCs/>
-        </w:rPr>
-        <w:t>Les modalités et tarifs sont adaptés en fonction de la demande.</w:t>
-      </w:r>
-      <w:r>
-        <w:rPr>
-          <w:b/>
-          <w:bCs/>
-        </w:rPr>
-        <w:br/>
-        <w:t>Je vous invite à me contacter directement afin d’en discuter ensemble.</w:t>
-      </w:r>
-    </w:p>
-    <w:p>
-      <w:pPr>
-        <w:rPr>
-          <w:b/>
-          <w:bCs/>
-        </w:rPr>
-      </w:pPr>
-      <w:r>
-        <w:rPr>
-          <w:b/>
-          <w:bCs/>
-        </w:rPr>
-        <w:br/>
-      </w:r>
-    </w:p>
-    <w:p>
-      <w:pPr>
-        <w:numPr>
-          <w:ilvl w:val="0"/>
-          <w:numId w:val="2"/>
-        </w:numPr>
-        <w:rPr>
-          <w:b/>
-          <w:bCs/>
-        </w:rPr>
-      </w:pPr>
-      <w:r>
-        <w:rPr>
-          <w:b/>
-          <w:bCs/>
-        </w:rPr>
-        <w:t>Citation (à placer en bas de page) :</w:t>
-      </w:r>
-    </w:p>
-    <w:p>
-      <w:pPr>
-        <w:rPr>
-          <w:b/>
-          <w:bCs/>
-        </w:rPr>
-      </w:pPr>
-      <w:r>
-        <w:rPr>
-          <w:b/>
-          <w:bCs/>
-          <w:i/>
-          <w:iCs/>
-        </w:rPr>
-        <w:t>“Le corps sait des choses que nous ne savons pas encore.”</w:t>
-      </w:r>
-      <w:r>
-        <w:rPr>
-          <w:b/>
-          <w:bCs/>
-        </w:rPr>
-        <w:t xml:space="preserve"> — E. </w:t>
-      </w:r>
-      <w:proofErr w:type="spellStart"/>
-      <w:r>
-        <w:rPr>
-          <w:b/>
-          <w:bCs/>
-        </w:rPr>
-        <w:t>Gendlin</w:t>
-      </w:r>
-      <w:proofErr w:type="spellEnd"/>
-    </w:p>
-    <w:p>
-      <w:pPr>
-        <w:rPr>
-          <w:b/>
-          <w:bCs/>
-        </w:rPr>
-      </w:pPr>
-      <w:r>
-        <w:rPr>
-          <w:b/>
-          <w:bCs/>
-        </w:rPr>
-        <w:pict w14:anchorId="7C9C47C2">
-          <v:rect id="_x0000_i1147" style="width:0;height:1.5pt" o:hralign="center" o:hrstd="t" o:hr="t" fillcolor="#a0a0a0" stroked="f"/>
-        </w:pict>
-      </w:r>
-    </w:p>
-    <w:p>
-      <w:pPr>
-        <w:rPr>
-          <w:b/>
-          <w:bCs/>
-        </w:rPr>
-      </w:pPr>
-      <w:r>
-        <w:rPr>
-          <w:b/>
-          <w:bCs/>
-        </w:rPr>
+        <w:t> WhatsApp</w:t>
+      </w:r>
+      <w:r>
+        <w:br/>
+      </w:r>
+      <w:r>
         <w:drawing>
-          <wp:inline distT="0" distB="0" distL="0" distR="0" wp14:anchorId="1279D48A" wp14:editId="1907BC28">
+          <wp:inline distT="0" distB="0" distL="0" distR="0" wp14:anchorId="6902419A" wp14:editId="1915EA03">
             <wp:extent cx="304800" cy="304800"/>
             <wp:effectExtent l="0" t="0" r="0" b="0"/>
-            <wp:docPr id="1078625439" name="Image 7" descr="🌿"/>
+            <wp:docPr id="454839822" name="Image 9" descr="👉"/>
             <wp:cNvGraphicFramePr>
               <a:graphicFrameLocks xmlns:a="http://schemas.openxmlformats.org/drawingml/2006/main" noChangeAspect="1"/>
             </wp:cNvGraphicFramePr>
@@ -244,7 +653,7 @@
               <a:graphicData uri="http://schemas.openxmlformats.org/drawingml/2006/picture">
                 <pic:pic xmlns:pic="http://schemas.openxmlformats.org/drawingml/2006/picture">
                   <pic:nvPicPr>
-                    <pic:cNvPr id="0" name="Picture 124" descr="🌿"/>
+                    <pic:cNvPr id="0" name="Picture 100" descr="👉"/>
                     <pic:cNvPicPr>
                       <a:picLocks noChangeAspect="1" noChangeArrowheads="1"/>
                     </pic:cNvPicPr>
@@ -282,256 +691,13 @@
         </w:drawing>
       </w:r>
       <w:r>
-        <w:rPr>
-          <w:b/>
-          <w:bCs/>
-        </w:rPr>
-        <w:t> PAGE ACCUEIL</w:t>
-      </w:r>
-    </w:p>
-    <w:p>
-      <w:pPr>
-        <w:rPr>
-          <w:b/>
-          <w:bCs/>
-        </w:rPr>
-      </w:pPr>
-      <w:r>
-        <w:rPr>
-          <w:b/>
-          <w:bCs/>
-        </w:rPr>
-        <w:t>Présentation</w:t>
-      </w:r>
-    </w:p>
-    <w:p>
-      <w:pPr>
-        <w:rPr>
-          <w:b/>
-          <w:bCs/>
-        </w:rPr>
-      </w:pPr>
-      <w:r>
-        <w:rPr>
-          <w:b/>
-          <w:bCs/>
-        </w:rPr>
-        <w:t>Je m’appelle Eugénie.</w:t>
-      </w:r>
-      <w:r>
-        <w:rPr>
-          <w:b/>
-          <w:bCs/>
-        </w:rPr>
-        <w:br/>
-        <w:t>Je suis gersoise d’origine.</w:t>
-      </w:r>
-    </w:p>
-    <w:p>
-      <w:pPr>
-        <w:rPr>
-          <w:b/>
-          <w:bCs/>
-        </w:rPr>
-      </w:pPr>
-      <w:r>
-        <w:rPr>
-          <w:b/>
-          <w:bCs/>
-        </w:rPr>
-        <w:t>Mon chemin m’a menée du monde du luxe, sur la côte d’Azur, aux ashrams en Inde,</w:t>
-      </w:r>
-      <w:r>
-        <w:rPr>
-          <w:b/>
-          <w:bCs/>
-        </w:rPr>
-        <w:br/>
-        <w:t>avant de revenir à quelque chose de plus simple.</w:t>
-      </w:r>
-    </w:p>
-    <w:p>
-      <w:pPr>
-        <w:rPr>
-          <w:b/>
-          <w:bCs/>
-        </w:rPr>
-      </w:pPr>
-      <w:r>
-        <w:rPr>
-          <w:b/>
-          <w:bCs/>
-        </w:rPr>
-        <w:t>Aujourd’hui, j’accompagne par le corps,</w:t>
-      </w:r>
-      <w:r>
-        <w:rPr>
-          <w:b/>
-          <w:bCs/>
-        </w:rPr>
-        <w:br/>
-        <w:t>avec une approche nourrie par le massage, le yoga et la méditation,</w:t>
-      </w:r>
-      <w:r>
-        <w:rPr>
-          <w:b/>
-          <w:bCs/>
-        </w:rPr>
-        <w:br/>
-        <w:t>et par un travail continu autour de la présence et de l’écoute.</w:t>
-      </w:r>
-    </w:p>
-    <w:p>
-      <w:pPr>
-        <w:rPr>
-          <w:b/>
-          <w:bCs/>
-        </w:rPr>
-      </w:pPr>
-      <w:r>
-        <w:rPr>
-          <w:b/>
-          <w:bCs/>
-        </w:rPr>
-        <w:t>J’ai travaillé dans l’univers du spa de luxe,</w:t>
-      </w:r>
-      <w:r>
-        <w:rPr>
-          <w:b/>
-          <w:bCs/>
-        </w:rPr>
-        <w:br/>
-        <w:t>et mes voyages ont nourri ma sensibilité,</w:t>
-      </w:r>
-      <w:r>
-        <w:rPr>
-          <w:b/>
-          <w:bCs/>
-        </w:rPr>
-        <w:br/>
-        <w:t>notamment à travers l’ayurvéda.</w:t>
-      </w:r>
-    </w:p>
-    <w:p>
-      <w:pPr>
-        <w:rPr>
-          <w:b/>
-          <w:bCs/>
-        </w:rPr>
-      </w:pPr>
-      <w:r>
-        <w:rPr>
-          <w:b/>
-          <w:bCs/>
-        </w:rPr>
-        <w:t>Je poursuis également une formation en thérapies humanistes.</w:t>
-      </w:r>
-    </w:p>
-    <w:p>
-      <w:pPr>
-        <w:rPr>
-          <w:b/>
-          <w:bCs/>
-        </w:rPr>
-      </w:pPr>
-      <w:r>
-        <w:rPr>
-          <w:b/>
-          <w:bCs/>
-        </w:rPr>
-        <w:t>Chaque séance est avant tout une présence,</w:t>
-      </w:r>
-      <w:r>
-        <w:rPr>
-          <w:b/>
-          <w:bCs/>
-        </w:rPr>
-        <w:br/>
-        <w:t>adaptée à ce qui est là, dans l’instant.</w:t>
-      </w:r>
-    </w:p>
-    <w:p>
-      <w:pPr>
-        <w:rPr>
-          <w:b/>
-          <w:bCs/>
-        </w:rPr>
-      </w:pPr>
-      <w:r>
-        <w:rPr>
-          <w:b/>
-          <w:bCs/>
-        </w:rPr>
-        <w:br/>
-      </w:r>
-    </w:p>
-    <w:p>
-      <w:pPr>
-        <w:rPr>
-          <w:b/>
-          <w:bCs/>
-        </w:rPr>
-      </w:pPr>
-      <w:r>
-        <w:rPr>
-          <w:b/>
-          <w:bCs/>
-        </w:rPr>
-        <w:t>Le cadre (à mettre avant réservation)</w:t>
-      </w:r>
-    </w:p>
-    <w:p>
-      <w:pPr>
-        <w:rPr>
-          <w:b/>
-          <w:bCs/>
-        </w:rPr>
-      </w:pPr>
-      <w:r>
-        <w:rPr>
-          <w:b/>
-          <w:bCs/>
-        </w:rPr>
-        <w:t>Les séances se déroulent dans un espace calme et confidentiel.</w:t>
-      </w:r>
-      <w:r>
-        <w:rPr>
-          <w:b/>
-          <w:bCs/>
-        </w:rPr>
-        <w:br/>
-        <w:t>Le respect, l’écoute et la sécurité sont au cœur de chaque accompagnement.</w:t>
-      </w:r>
-    </w:p>
-    <w:p>
-      <w:pPr>
-        <w:rPr>
-          <w:b/>
-          <w:bCs/>
-        </w:rPr>
-      </w:pPr>
-      <w:r>
-        <w:rPr>
-          <w:b/>
-          <w:bCs/>
-        </w:rPr>
-        <w:t>Les séances sont proposées en nombre limité chaque semaine.</w:t>
-      </w:r>
-    </w:p>
-    <w:p>
-      <w:pPr>
-        <w:rPr>
-          <w:b/>
-          <w:bCs/>
-        </w:rPr>
-      </w:pPr>
-      <w:r>
-        <w:rPr>
-          <w:b/>
-          <w:bCs/>
-        </w:rPr>
-        <w:pict w14:anchorId="66DB7DBC">
-          <v:rect id="_x0000_i1149" style="width:0;height:1.5pt" o:hralign="center" o:hrstd="t" o:hr="t" fillcolor="#a0a0a0" stroked="f"/>
+        <w:t> Email</w:t>
+      </w:r>
+    </w:p>
+    <w:p>
+      <w:r>
+        <w:pict w14:anchorId="169B9D72">
+          <v:rect id="_x0000_i1125" style="width:0;height:1.5pt" o:hralign="center" o:hrstd="t" o:hr="t" fillcolor="#a0a0a0" stroked="f"/>
         </w:pict>
       </w:r>
     </w:p>
@@ -547,12 +713,11 @@
           <w:b/>
           <w:bCs/>
         </w:rPr>
-        <w:lastRenderedPageBreak/>
         <w:drawing>
-          <wp:inline distT="0" distB="0" distL="0" distR="0" wp14:anchorId="0D7379B4" wp14:editId="5F3B8D9C">
+          <wp:inline distT="0" distB="0" distL="0" distR="0" wp14:anchorId="6AF3D27D" wp14:editId="4CBD5660">
             <wp:extent cx="304800" cy="304800"/>
             <wp:effectExtent l="0" t="0" r="0" b="0"/>
-            <wp:docPr id="85539858" name="Image 6" descr="🌿"/>
+            <wp:docPr id="1759087790" name="Image 8" descr="🌿"/>
             <wp:cNvGraphicFramePr>
               <a:graphicFrameLocks xmlns:a="http://schemas.openxmlformats.org/drawingml/2006/main" noChangeAspect="1"/>
             </wp:cNvGraphicFramePr>
@@ -560,7 +725,79 @@
               <a:graphicData uri="http://schemas.openxmlformats.org/drawingml/2006/picture">
                 <pic:pic xmlns:pic="http://schemas.openxmlformats.org/drawingml/2006/picture">
                   <pic:nvPicPr>
-                    <pic:cNvPr id="0" name="Picture 126" descr="🌿"/>
+                    <pic:cNvPr id="0" name="Picture 102" descr="🌿"/>
+                    <pic:cNvPicPr>
+                      <a:picLocks noChangeAspect="1" noChangeArrowheads="1"/>
+                    </pic:cNvPicPr>
+                  </pic:nvPicPr>
+                  <pic:blipFill>
+                    <a:blip r:embed="rId6">
+                      <a:extLst>
+                        <a:ext uri="{28A0092B-C50C-407E-A947-70E740481C1C}">
+                          <a14:useLocalDpi xmlns:a14="http://schemas.microsoft.com/office/drawing/2010/main" val="0"/>
+                        </a:ext>
+                      </a:extLst>
+                    </a:blip>
+                    <a:srcRect/>
+                    <a:stretch>
+                      <a:fillRect/>
+                    </a:stretch>
+                  </pic:blipFill>
+                  <pic:spPr bwMode="auto">
+                    <a:xfrm>
+                      <a:off x="0" y="0"/>
+                      <a:ext cx="304800" cy="304800"/>
+                    </a:xfrm>
+                    <a:prstGeom prst="rect">
+                      <a:avLst/>
+                    </a:prstGeom>
+                    <a:noFill/>
+                    <a:ln>
+                      <a:noFill/>
+                    </a:ln>
+                  </pic:spPr>
+                </pic:pic>
+              </a:graphicData>
+            </a:graphic>
+          </wp:inline>
+        </w:drawing>
+      </w:r>
+      <w:r>
+        <w:rPr>
+          <w:b/>
+          <w:bCs/>
+        </w:rPr>
+        <w:t> SECTION 8 — CITATION</w:t>
+      </w:r>
+    </w:p>
+    <w:p>
+      <w:r>
+        <w:t>“Le corps sait des choses que nous ne savons pas encore.”</w:t>
+      </w:r>
+      <w:r>
+        <w:br/>
+        <w:t>— Eugene Gendlin</w:t>
+      </w:r>
+    </w:p>
+    <w:p>
+      <w:r>
+        <w:rPr>
+          <w:i/>
+          <w:iCs/>
+        </w:rPr>
+        <w:drawing>
+          <wp:inline distT="0" distB="0" distL="0" distR="0" wp14:anchorId="26DEE878" wp14:editId="5B3834B2">
+            <wp:extent cx="304800" cy="304800"/>
+            <wp:effectExtent l="0" t="0" r="0" b="0"/>
+            <wp:docPr id="1711048717" name="Image 7" descr="👉"/>
+            <wp:cNvGraphicFramePr>
+              <a:graphicFrameLocks xmlns:a="http://schemas.openxmlformats.org/drawingml/2006/main" noChangeAspect="1"/>
+            </wp:cNvGraphicFramePr>
+            <a:graphic xmlns:a="http://schemas.openxmlformats.org/drawingml/2006/main">
+              <a:graphicData uri="http://schemas.openxmlformats.org/drawingml/2006/picture">
+                <pic:pic xmlns:pic="http://schemas.openxmlformats.org/drawingml/2006/picture">
+                  <pic:nvPicPr>
+                    <pic:cNvPr id="0" name="Picture 103" descr="👉"/>
                     <pic:cNvPicPr>
                       <a:picLocks noChangeAspect="1" noChangeArrowheads="1"/>
                     </pic:cNvPicPr>
@@ -599,314 +836,127 @@
       </w:r>
       <w:r>
         <w:rPr>
-          <w:b/>
-          <w:bCs/>
-        </w:rPr>
-        <w:t> PAGE “LE SOIN”</w:t>
-      </w:r>
-    </w:p>
-    <w:p>
-      <w:pPr>
-        <w:rPr>
-          <w:b/>
-          <w:bCs/>
-        </w:rPr>
-      </w:pPr>
-      <w:r>
-        <w:rPr>
-          <w:b/>
-          <w:bCs/>
-        </w:rPr>
-        <w:t>Le soin </w:t>
-      </w:r>
-    </w:p>
-    <w:p>
-      <w:pPr>
-        <w:rPr>
-          <w:b/>
-          <w:bCs/>
-        </w:rPr>
-      </w:pPr>
-      <w:r>
-        <w:rPr>
-          <w:b/>
-          <w:bCs/>
-        </w:rPr>
-        <w:t>Un massage unique.</w:t>
-      </w:r>
-    </w:p>
-    <w:p>
-      <w:pPr>
-        <w:rPr>
-          <w:b/>
-          <w:bCs/>
-        </w:rPr>
-      </w:pPr>
-      <w:r>
-        <w:rPr>
-          <w:b/>
-          <w:bCs/>
-        </w:rPr>
-        <w:t>Un soin qui se construit dans l’instant,</w:t>
-      </w:r>
-      <w:r>
-        <w:rPr>
-          <w:b/>
-          <w:bCs/>
-        </w:rPr>
-        <w:br/>
-        <w:t>à partir de ce qui est là.</w:t>
-      </w:r>
-    </w:p>
-    <w:p>
-      <w:pPr>
-        <w:rPr>
-          <w:b/>
-          <w:bCs/>
-        </w:rPr>
-      </w:pPr>
-      <w:r>
-        <w:rPr>
-          <w:b/>
-          <w:bCs/>
-        </w:rPr>
-        <w:t>Le toucher est lent, enveloppant, parfois plus appuyé.</w:t>
-      </w:r>
-      <w:r>
-        <w:rPr>
-          <w:b/>
-          <w:bCs/>
-        </w:rPr>
-        <w:br/>
-        <w:t>Il suit le corps, plutôt qu’il ne dirige.</w:t>
-      </w:r>
-    </w:p>
-    <w:p>
-      <w:pPr>
-        <w:rPr>
-          <w:b/>
-          <w:bCs/>
-        </w:rPr>
-      </w:pPr>
-      <w:r>
-        <w:rPr>
-          <w:b/>
-          <w:bCs/>
-        </w:rPr>
-        <w:t>Un espace pour relâcher,</w:t>
-      </w:r>
-      <w:r>
-        <w:rPr>
-          <w:b/>
-          <w:bCs/>
-        </w:rPr>
-        <w:br/>
-        <w:t>et revenir à des sensations plus simples.</w:t>
-      </w:r>
-    </w:p>
-    <w:p>
-      <w:pPr>
-        <w:rPr>
-          <w:b/>
-          <w:bCs/>
-        </w:rPr>
-      </w:pPr>
-      <w:r>
-        <w:rPr>
-          <w:b/>
-          <w:bCs/>
-        </w:rPr>
-        <w:pict w14:anchorId="2210B127">
-          <v:rect id="_x0000_i1151" style="width:0;height:1.5pt" o:hralign="center" o:hrstd="t" o:hr="t" fillcolor="#a0a0a0" stroked="f"/>
+          <w:i/>
+          <w:iCs/>
+        </w:rPr>
+        <w:t> DA : bloc isolé, centré, avec beaucoup d’espace autour. Typographie légèrement différente (italique ou plus fine). Très important pour la respiration globale du site.</w:t>
+      </w:r>
+    </w:p>
+    <w:p>
+      <w:r>
+        <w:pict w14:anchorId="5088FC2A">
+          <v:rect id="_x0000_i1128" style="width:0;height:1.5pt" o:hralign="center" o:hrstd="t" o:hr="t" fillcolor="#a0a0a0" stroked="f"/>
         </w:pict>
       </w:r>
     </w:p>
     <w:p>
-      <w:pPr>
-        <w:rPr>
-          <w:b/>
-          <w:bCs/>
-        </w:rPr>
-      </w:pPr>
-      <w:r>
-        <w:rPr>
-          <w:b/>
-          <w:bCs/>
-        </w:rPr>
-        <w:t>Informations</w:t>
-      </w:r>
-    </w:p>
-    <w:p>
-      <w:pPr>
-        <w:rPr>
-          <w:b/>
-          <w:bCs/>
-        </w:rPr>
-      </w:pPr>
-      <w:r>
-        <w:rPr>
-          <w:b/>
-          <w:bCs/>
-        </w:rPr>
-        <w:t>Le soin se reçoit à l’huile d’amande douce chaude, jusqu’au cuir chevelu.</w:t>
-      </w:r>
-      <w:r>
-        <w:rPr>
-          <w:b/>
-          <w:bCs/>
-        </w:rPr>
-        <w:br/>
-        <w:t>Prendre le temps ensuite fait partie de l’expérience.</w:t>
-      </w:r>
-    </w:p>
-    <w:p>
-      <w:pPr>
-        <w:rPr>
-          <w:b/>
-          <w:bCs/>
-        </w:rPr>
-      </w:pPr>
-      <w:r>
-        <w:rPr>
-          <w:b/>
-          <w:bCs/>
-        </w:rPr>
-        <w:pict w14:anchorId="7568F8EF">
-          <v:rect id="_x0000_i1152" style="width:0;height:1.5pt" o:hralign="center" o:hrstd="t" o:hr="t" fillcolor="#a0a0a0" stroked="f"/>
-        </w:pict>
-      </w:r>
-    </w:p>
-    <w:p>
-      <w:pPr>
-        <w:rPr>
-          <w:b/>
-          <w:bCs/>
-        </w:rPr>
-      </w:pPr>
-      <w:r>
-        <w:rPr>
-          <w:b/>
-          <w:bCs/>
-        </w:rPr>
-        <w:t>Le déroulé </w:t>
-      </w:r>
-    </w:p>
-    <w:p>
-      <w:pPr>
-        <w:rPr>
-          <w:b/>
-          <w:bCs/>
-        </w:rPr>
-      </w:pPr>
-      <w:r>
-        <w:rPr>
-          <w:b/>
-          <w:bCs/>
-        </w:rPr>
-        <w:t>Chaque séance commence par un temps d’échange.</w:t>
-      </w:r>
-    </w:p>
-    <w:p>
-      <w:pPr>
-        <w:rPr>
-          <w:b/>
-          <w:bCs/>
-        </w:rPr>
-      </w:pPr>
-      <w:r>
-        <w:rPr>
-          <w:b/>
-          <w:bCs/>
-        </w:rPr>
-        <w:t>Le massage se reçoit à l’huile chaude,</w:t>
-      </w:r>
-      <w:r>
-        <w:rPr>
-          <w:b/>
-          <w:bCs/>
-        </w:rPr>
-        <w:br/>
-        <w:t>dans un rythme lent et adapté à chacun.</w:t>
-      </w:r>
-    </w:p>
-    <w:p>
-      <w:pPr>
-        <w:rPr>
-          <w:b/>
-          <w:bCs/>
-        </w:rPr>
-      </w:pPr>
-      <w:r>
-        <w:rPr>
-          <w:b/>
-          <w:bCs/>
-        </w:rPr>
-        <w:t>Un temps est laissé à la fin,</w:t>
-      </w:r>
-      <w:r>
-        <w:rPr>
-          <w:b/>
-          <w:bCs/>
-        </w:rPr>
-        <w:br/>
-        <w:t>pour revenir tranquillement.</w:t>
-      </w:r>
-    </w:p>
-    <w:p>
-      <w:pPr>
-        <w:rPr>
-          <w:b/>
-          <w:bCs/>
-        </w:rPr>
-      </w:pPr>
-      <w:r>
-        <w:rPr>
-          <w:b/>
-          <w:bCs/>
-        </w:rPr>
-        <w:t>Le soin peut inclure des dimensions sonores et olfactives,</w:t>
-      </w:r>
-      <w:r>
-        <w:rPr>
-          <w:b/>
-          <w:bCs/>
-        </w:rPr>
-        <w:br/>
-        <w:t>selon ce qui se présente.</w:t>
-      </w:r>
-    </w:p>
-    <w:p>
-      <w:pPr>
-        <w:rPr>
-          <w:b/>
-          <w:bCs/>
-        </w:rPr>
-      </w:pPr>
-      <w:r>
-        <w:rPr>
-          <w:b/>
-          <w:bCs/>
-        </w:rPr>
-        <w:br/>
-      </w:r>
-    </w:p>
-    <w:p>
-      <w:pPr>
-        <w:rPr>
-          <w:b/>
-          <w:bCs/>
-        </w:rPr>
-      </w:pPr>
-      <w:r>
-        <w:rPr>
-          <w:b/>
-          <w:bCs/>
+      <w:r>
+        <w:lastRenderedPageBreak/>
+        <w:br/>
+      </w:r>
+    </w:p>
+    <w:p>
+      <w:pPr>
+        <w:rPr>
+          <w:b/>
+          <w:bCs/>
+        </w:rPr>
+      </w:pPr>
+      <w:r>
+        <w:rPr>
+          <w:b/>
+          <w:bCs/>
+        </w:rPr>
+        <w:t>FAQ</w:t>
+      </w:r>
+    </w:p>
+    <w:p>
+      <w:pPr>
+        <w:rPr>
+          <w:b/>
+          <w:bCs/>
+        </w:rPr>
+      </w:pPr>
+      <w:r>
+        <w:rPr>
+          <w:b/>
+          <w:bCs/>
+        </w:rPr>
+        <w:t>Faut-il prévoir quelque chose après la séance ?</w:t>
+      </w:r>
+    </w:p>
+    <w:p>
+      <w:r>
+        <w:t>Un temps calme est idéal après le soin pour laisser le corps intégrer.</w:t>
+      </w:r>
+      <w:r>
+        <w:br/>
+        <w:t>Il est également conseillé de boire de l’eau.</w:t>
+      </w:r>
+    </w:p>
+    <w:p>
+      <w:pPr>
+        <w:rPr>
+          <w:b/>
+          <w:bCs/>
+        </w:rPr>
+      </w:pPr>
+      <w:r>
+        <w:rPr>
+          <w:b/>
+          <w:bCs/>
+        </w:rPr>
+        <w:t>Comment s’habiller ?</w:t>
+      </w:r>
+    </w:p>
+    <w:p>
+      <w:r>
+        <w:t>Venez simplement dans une tenue confortable.</w:t>
+      </w:r>
+      <w:r>
+        <w:br/>
+        <w:t>Prévoyez des vêtements qui ne craignent pas l’huile.</w:t>
+      </w:r>
+      <w:r>
+        <w:br/>
+        <w:t>Les bijoux sont retirés avant la séance.</w:t>
+      </w:r>
+    </w:p>
+    <w:p>
+      <w:pPr>
+        <w:rPr>
+          <w:b/>
+          <w:bCs/>
+        </w:rPr>
+      </w:pPr>
+      <w:r>
+        <w:rPr>
+          <w:b/>
+          <w:bCs/>
+        </w:rPr>
+        <w:t>Est-ce que le soin est adapté à tous ?</w:t>
+      </w:r>
+    </w:p>
+    <w:p>
+      <w:r>
+        <w:t>Le soin s’adapte à chaque personne, dans le respect du corps et de ses besoins.</w:t>
+      </w:r>
+      <w:r>
+        <w:br/>
+        <w:t>Il peut être reçu à tout âge, avec une approche toujours ajustée.</w:t>
+      </w:r>
+    </w:p>
+    <w:p>
+      <w:r>
+        <w:rPr>
+          <w:i/>
+          <w:iCs/>
         </w:rPr>
         <w:drawing>
-          <wp:inline distT="0" distB="0" distL="0" distR="0" wp14:anchorId="5722EBDF" wp14:editId="0525F157">
+          <wp:inline distT="0" distB="0" distL="0" distR="0" wp14:anchorId="323EB66B" wp14:editId="53C3EB4E">
             <wp:extent cx="304800" cy="304800"/>
             <wp:effectExtent l="0" t="0" r="0" b="0"/>
-            <wp:docPr id="1566283904" name="Image 5" descr="🌿"/>
+            <wp:docPr id="1139680853" name="Image 6" descr="👉"/>
             <wp:cNvGraphicFramePr>
               <a:graphicFrameLocks xmlns:a="http://schemas.openxmlformats.org/drawingml/2006/main" noChangeAspect="1"/>
             </wp:cNvGraphicFramePr>
@@ -914,7 +964,7 @@
               <a:graphicData uri="http://schemas.openxmlformats.org/drawingml/2006/picture">
                 <pic:pic xmlns:pic="http://schemas.openxmlformats.org/drawingml/2006/picture">
                   <pic:nvPicPr>
-                    <pic:cNvPr id="0" name="Picture 129" descr="🌿"/>
+                    <pic:cNvPr id="0" name="Picture 105" descr="👉"/>
                     <pic:cNvPicPr>
                       <a:picLocks noChangeAspect="1" noChangeArrowheads="1"/>
                     </pic:cNvPicPr>
@@ -953,231 +1003,13 @@
       </w:r>
       <w:r>
         <w:rPr>
-          <w:b/>
-          <w:bCs/>
-        </w:rPr>
-        <w:t> FAQ </w:t>
-      </w:r>
-    </w:p>
-    <w:p>
-      <w:pPr>
-        <w:rPr>
-          <w:b/>
-          <w:bCs/>
-        </w:rPr>
-      </w:pPr>
-      <w:r>
-        <w:rPr>
-          <w:b/>
-          <w:bCs/>
-        </w:rPr>
-        <w:br/>
-      </w:r>
-    </w:p>
-    <w:p>
-      <w:pPr>
-        <w:rPr>
-          <w:b/>
-          <w:bCs/>
-        </w:rPr>
-      </w:pPr>
-      <w:r>
-        <w:rPr>
-          <w:b/>
-          <w:bCs/>
-        </w:rPr>
-        <w:t>Faut-il prévoir quelque chose après la séance ?</w:t>
-      </w:r>
-    </w:p>
-    <w:p>
-      <w:pPr>
-        <w:rPr>
-          <w:b/>
-          <w:bCs/>
-        </w:rPr>
-      </w:pPr>
-      <w:r>
-        <w:rPr>
-          <w:b/>
-          <w:bCs/>
-        </w:rPr>
-        <w:t>Je vous invite à prévoir un moment tranquille après le soin,</w:t>
-      </w:r>
-      <w:r>
-        <w:rPr>
-          <w:b/>
-          <w:bCs/>
-        </w:rPr>
-        <w:br/>
-        <w:t>pour laisser le corps intégrer.</w:t>
-      </w:r>
-    </w:p>
-    <w:p>
-      <w:pPr>
-        <w:rPr>
-          <w:b/>
-          <w:bCs/>
-        </w:rPr>
-      </w:pPr>
-      <w:r>
-        <w:rPr>
-          <w:b/>
-          <w:bCs/>
-        </w:rPr>
-        <w:t>Porter une tenue confortable qui ne craint pas l’huile est préférable.</w:t>
-      </w:r>
-      <w:r>
-        <w:rPr>
-          <w:b/>
-          <w:bCs/>
-        </w:rPr>
-        <w:br/>
-        <w:t>Boire de l’eau ensuite est recommandé.</w:t>
-      </w:r>
-    </w:p>
-    <w:p>
-      <w:pPr>
-        <w:rPr>
-          <w:b/>
-          <w:bCs/>
-        </w:rPr>
-      </w:pPr>
-      <w:r>
-        <w:rPr>
-          <w:b/>
-          <w:bCs/>
-        </w:rPr>
-        <w:pict w14:anchorId="71BFBE5F">
-          <v:rect id="_x0000_i1154" style="width:0;height:1.5pt" o:hralign="center" o:hrstd="t" o:hr="t" fillcolor="#a0a0a0" stroked="f"/>
-        </w:pict>
-      </w:r>
-    </w:p>
-    <w:p>
-      <w:pPr>
-        <w:rPr>
-          <w:b/>
-          <w:bCs/>
-        </w:rPr>
-      </w:pPr>
-      <w:r>
-        <w:rPr>
-          <w:b/>
-          <w:bCs/>
-        </w:rPr>
-        <w:t>Comment s’habiller ?</w:t>
-      </w:r>
-    </w:p>
-    <w:p>
-      <w:pPr>
-        <w:rPr>
-          <w:b/>
-          <w:bCs/>
-        </w:rPr>
-      </w:pPr>
-      <w:r>
-        <w:rPr>
-          <w:b/>
-          <w:bCs/>
-        </w:rPr>
-        <w:lastRenderedPageBreak/>
-        <w:t>Vous pouvez venir simplement, comme vous êtes.</w:t>
-      </w:r>
-    </w:p>
-    <w:p>
-      <w:pPr>
-        <w:rPr>
-          <w:b/>
-          <w:bCs/>
-        </w:rPr>
-      </w:pPr>
-      <w:r>
-        <w:rPr>
-          <w:b/>
-          <w:bCs/>
-        </w:rPr>
-        <w:t>Une tenue confortable pour l’après séance est conseillée.</w:t>
-      </w:r>
-      <w:r>
-        <w:rPr>
-          <w:b/>
-          <w:bCs/>
-        </w:rPr>
-        <w:br/>
-        <w:t>Les bijoux seront retirés avant le massage.</w:t>
-      </w:r>
-    </w:p>
-    <w:p>
-      <w:pPr>
-        <w:rPr>
-          <w:b/>
-          <w:bCs/>
-        </w:rPr>
-      </w:pPr>
-      <w:r>
-        <w:rPr>
-          <w:b/>
-          <w:bCs/>
-        </w:rPr>
-        <w:pict w14:anchorId="63F74615">
-          <v:rect id="_x0000_i1155" style="width:0;height:1.5pt" o:hralign="center" o:hrstd="t" o:hr="t" fillcolor="#a0a0a0" stroked="f"/>
-        </w:pict>
-      </w:r>
-    </w:p>
-    <w:p>
-      <w:pPr>
-        <w:rPr>
-          <w:b/>
-          <w:bCs/>
-        </w:rPr>
-      </w:pPr>
-      <w:r>
-        <w:rPr>
-          <w:b/>
-          <w:bCs/>
-        </w:rPr>
-        <w:t>Le massage est-il adapté à tous ?</w:t>
-      </w:r>
-    </w:p>
-    <w:p>
-      <w:pPr>
-        <w:rPr>
-          <w:b/>
-          <w:bCs/>
-        </w:rPr>
-      </w:pPr>
-      <w:r>
-        <w:rPr>
-          <w:b/>
-          <w:bCs/>
-        </w:rPr>
-        <w:t>Le massage s’adapte à chaque personne,</w:t>
-      </w:r>
-      <w:r>
-        <w:rPr>
-          <w:b/>
-          <w:bCs/>
-        </w:rPr>
-        <w:br/>
-        <w:t>dans le respect du corps et de ses besoins.</w:t>
-      </w:r>
-    </w:p>
-    <w:p>
-      <w:r>
-        <w:rPr>
-          <w:b/>
-          <w:bCs/>
-        </w:rPr>
-        <w:t>Il peut être reçu à tout âge,</w:t>
-      </w:r>
-      <w:r>
-        <w:rPr>
-          <w:b/>
-          <w:bCs/>
-        </w:rPr>
-        <w:br/>
-        <w:t>avec une approche toujours ajustée.</w:t>
-      </w:r>
-    </w:p>
+          <w:i/>
+          <w:iCs/>
+        </w:rPr>
+        <w:t> DA : format accordéon (questions qui s’ouvrent). Design simple.</w:t>
+      </w:r>
+    </w:p>
+    <w:p/>
     <w:sectPr>
       <w:pgSz w:w="11906" w:h="16838"/>
       <w:pgMar w:top="1417" w:right="1417" w:bottom="1417" w:left="1417" w:header="708" w:footer="708" w:gutter="0"/>

</xml_diff>